<commit_message>
Agrego diagrama de transicion de estados
</commit_message>
<xml_diff>
--- a/3er entrega TPI - comision 1 grupo 5.docx
+++ b/3er entrega TPI - comision 1 grupo 5.docx
@@ -1,6 +1,6 @@
 
 <file path=word/document.xml><?xml version="1.0" encoding="utf-8"?>
-<w:document xmlns:wpc="http://schemas.microsoft.com/office/word/2010/wordprocessingCanvas" xmlns:cx="http://schemas.microsoft.com/office/drawing/2014/chartex" xmlns:cx1="http://schemas.microsoft.com/office/drawing/2015/9/8/chartex" xmlns:cx2="http://schemas.microsoft.com/office/drawing/2015/10/21/chartex" xmlns:cx3="http://schemas.microsoft.com/office/drawing/2016/5/9/chartex" xmlns:cx4="http://schemas.microsoft.com/office/drawing/2016/5/10/chartex" xmlns:cx5="http://schemas.microsoft.com/office/drawing/2016/5/11/chartex" xmlns:cx6="http://schemas.microsoft.com/office/drawing/2016/5/12/chartex" xmlns:cx7="http://schemas.microsoft.com/office/drawing/2016/5/13/chartex" xmlns:cx8="http://schemas.microsoft.com/office/drawing/2016/5/14/chartex" xmlns:mc="http://schemas.openxmlformats.org/markup-compatibility/2006" xmlns:aink="http://schemas.microsoft.com/office/drawing/2016/ink" xmlns:am3d="http://schemas.microsoft.com/office/drawing/2017/model3d" xmlns:o="urn:schemas-microsoft-com:office:office" xmlns:r="http://schemas.openxmlformats.org/officeDocument/2006/relationships" xmlns:m="http://schemas.openxmlformats.org/officeDocument/2006/math" xmlns:v="urn:schemas-microsoft-com:vml" xmlns:wp14="http://schemas.microsoft.com/office/word/2010/wordprocessingDrawing" xmlns:wp="http://schemas.openxmlformats.org/drawingml/2006/wordprocessingDrawing" xmlns:w10="urn:schemas-microsoft-com:office:word" xmlns:w="http://schemas.openxmlformats.org/wordprocessingml/2006/main" xmlns:w14="http://schemas.microsoft.com/office/word/2010/wordml" xmlns:w15="http://schemas.microsoft.com/office/word/2012/wordml" xmlns:w16cex="http://schemas.microsoft.com/office/word/2018/wordml/cex" xmlns:w16cid="http://schemas.microsoft.com/office/word/2016/wordml/cid" xmlns:w16="http://schemas.microsoft.com/office/word/2018/wordml" xmlns:w16sdtdh="http://schemas.microsoft.com/office/word/2020/wordml/sdtdatahash" xmlns:w16se="http://schemas.microsoft.com/office/word/2015/wordml/symex" xmlns:wpg="http://schemas.microsoft.com/office/word/2010/wordprocessingGroup" xmlns:wpi="http://schemas.microsoft.com/office/word/2010/wordprocessingInk" xmlns:wne="http://schemas.microsoft.com/office/word/2006/wordml" xmlns:wps="http://schemas.microsoft.com/office/word/2010/wordprocessingShape" mc:Ignorable="w14 w15 w16se w16cid w16 w16cex w16sdtdh wp14">
+<w:document xmlns:wpc="http://schemas.microsoft.com/office/word/2010/wordprocessingCanvas" xmlns:cx="http://schemas.microsoft.com/office/drawing/2014/chartex" xmlns:cx1="http://schemas.microsoft.com/office/drawing/2015/9/8/chartex" xmlns:cx2="http://schemas.microsoft.com/office/drawing/2015/10/21/chartex" xmlns:cx3="http://schemas.microsoft.com/office/drawing/2016/5/9/chartex" xmlns:cx4="http://schemas.microsoft.com/office/drawing/2016/5/10/chartex" xmlns:cx5="http://schemas.microsoft.com/office/drawing/2016/5/11/chartex" xmlns:cx6="http://schemas.microsoft.com/office/drawing/2016/5/12/chartex" xmlns:cx7="http://schemas.microsoft.com/office/drawing/2016/5/13/chartex" xmlns:cx8="http://schemas.microsoft.com/office/drawing/2016/5/14/chartex" xmlns:mc="http://schemas.openxmlformats.org/markup-compatibility/2006" xmlns:aink="http://schemas.microsoft.com/office/drawing/2016/ink" xmlns:am3d="http://schemas.microsoft.com/office/drawing/2017/model3d" xmlns:o="urn:schemas-microsoft-com:office:office" xmlns:oel="http://schemas.microsoft.com/office/2019/extlst" xmlns:r="http://schemas.openxmlformats.org/officeDocument/2006/relationships" xmlns:m="http://schemas.openxmlformats.org/officeDocument/2006/math" xmlns:v="urn:schemas-microsoft-com:vml" xmlns:wp14="http://schemas.microsoft.com/office/word/2010/wordprocessingDrawing" xmlns:wp="http://schemas.openxmlformats.org/drawingml/2006/wordprocessingDrawing" xmlns:w10="urn:schemas-microsoft-com:office:word" xmlns:w="http://schemas.openxmlformats.org/wordprocessingml/2006/main" xmlns:w14="http://schemas.microsoft.com/office/word/2010/wordml" xmlns:w15="http://schemas.microsoft.com/office/word/2012/wordml" xmlns:w16cex="http://schemas.microsoft.com/office/word/2018/wordml/cex" xmlns:w16cid="http://schemas.microsoft.com/office/word/2016/wordml/cid" xmlns:w16="http://schemas.microsoft.com/office/word/2018/wordml" xmlns:w16du="http://schemas.microsoft.com/office/word/2023/wordml/word16du" xmlns:w16sdtdh="http://schemas.microsoft.com/office/word/2020/wordml/sdtdatahash" xmlns:w16sdtfl="http://schemas.microsoft.com/office/word/2024/wordml/sdtformatlock" xmlns:w16se="http://schemas.microsoft.com/office/word/2015/wordml/symex" xmlns:wpg="http://schemas.microsoft.com/office/word/2010/wordprocessingGroup" xmlns:wpi="http://schemas.microsoft.com/office/word/2010/wordprocessingInk" xmlns:wne="http://schemas.microsoft.com/office/word/2006/wordml" xmlns:wps="http://schemas.microsoft.com/office/word/2010/wordprocessingShape" mc:Ignorable="w14 w15 w16se w16cid w16 w16cex w16sdtdh w16sdtfl w16du wp14">
   <w:body>
     <w:p>
       <w:pPr>
@@ -267,23 +267,7 @@
           <w:rFonts w:ascii="Arial" w:eastAsia="Arial" w:hAnsi="Arial" w:cs="Arial"/>
           <w:sz w:val="18"/>
         </w:rPr>
-        <w:t xml:space="preserve">Ing. Paola </w:t>
-      </w:r>
-      <w:proofErr w:type="spellStart"/>
-      <w:r>
-        <w:rPr>
-          <w:rFonts w:ascii="Arial" w:eastAsia="Arial" w:hAnsi="Arial" w:cs="Arial"/>
-          <w:sz w:val="18"/>
-        </w:rPr>
-        <w:t>Simielli</w:t>
-      </w:r>
-      <w:proofErr w:type="spellEnd"/>
-      <w:r>
-        <w:rPr>
-          <w:rFonts w:ascii="Arial" w:eastAsia="Arial" w:hAnsi="Arial" w:cs="Arial"/>
-          <w:sz w:val="18"/>
-        </w:rPr>
-        <w:t xml:space="preserve"> </w:t>
+        <w:t xml:space="preserve">Ing. Paola Simielli </w:t>
       </w:r>
     </w:p>
     <w:p>
@@ -416,21 +400,12 @@
           <w:rFonts w:ascii="Arial" w:hAnsi="Arial"/>
         </w:rPr>
       </w:pPr>
-      <w:proofErr w:type="spellStart"/>
       <w:r>
         <w:rPr>
           <w:rFonts w:ascii="Arial" w:eastAsia="Arial" w:hAnsi="Arial" w:cs="Arial"/>
           <w:sz w:val="18"/>
         </w:rPr>
-        <w:t>Martinotti</w:t>
-      </w:r>
-      <w:proofErr w:type="spellEnd"/>
-      <w:r>
-        <w:rPr>
-          <w:rFonts w:ascii="Arial" w:eastAsia="Arial" w:hAnsi="Arial" w:cs="Arial"/>
-          <w:sz w:val="18"/>
-        </w:rPr>
-        <w:t xml:space="preserve">, Lorenzo </w:t>
+        <w:t xml:space="preserve">Martinotti, Lorenzo </w:t>
       </w:r>
       <w:r>
         <w:rPr>
@@ -623,21 +598,12 @@
           <w:rFonts w:ascii="Arial" w:hAnsi="Arial"/>
         </w:rPr>
       </w:pPr>
-      <w:proofErr w:type="spellStart"/>
       <w:r>
         <w:rPr>
           <w:rFonts w:ascii="Arial" w:eastAsia="Arial" w:hAnsi="Arial" w:cs="Arial"/>
           <w:sz w:val="18"/>
         </w:rPr>
-        <w:t>Allocco</w:t>
-      </w:r>
-      <w:proofErr w:type="spellEnd"/>
-      <w:r>
-        <w:rPr>
-          <w:rFonts w:ascii="Arial" w:eastAsia="Arial" w:hAnsi="Arial" w:cs="Arial"/>
-          <w:sz w:val="18"/>
-        </w:rPr>
-        <w:t xml:space="preserve">, Agustin </w:t>
+        <w:t xml:space="preserve">Allocco, Agustin </w:t>
       </w:r>
       <w:r>
         <w:rPr>
@@ -994,7 +960,6 @@
           <w:docPartUnique/>
         </w:docPartObj>
       </w:sdtPr>
-      <w:sdtEndPr/>
       <w:sdtContent>
         <w:p>
           <w:pPr>
@@ -1717,23 +1682,7 @@
           <w:rFonts w:ascii="Arial" w:eastAsia="Arial" w:hAnsi="Arial" w:cs="Arial"/>
           <w:szCs w:val="22"/>
         </w:rPr>
-        <w:t xml:space="preserve">Somos </w:t>
-      </w:r>
-      <w:proofErr w:type="spellStart"/>
-      <w:r>
-        <w:rPr>
-          <w:rFonts w:ascii="Arial" w:eastAsia="Arial" w:hAnsi="Arial" w:cs="Arial"/>
-          <w:szCs w:val="22"/>
-        </w:rPr>
-        <w:t>Omicron</w:t>
-      </w:r>
-      <w:proofErr w:type="spellEnd"/>
-      <w:r>
-        <w:rPr>
-          <w:rFonts w:ascii="Arial" w:eastAsia="Arial" w:hAnsi="Arial" w:cs="Arial"/>
-          <w:szCs w:val="22"/>
-        </w:rPr>
-        <w:t xml:space="preserve"> Dev, un equipo dedicado a la ingeniería en sistemas de información. Nuestro principal servicio es el análisis, diseño y desarrollo de soluciones de software para clientes particulares, pequeñas empresas y medianas organizaciones que necesiten mejorar la forma en que gestionan su información.</w:t>
+        <w:t>Somos Omicron Dev, un equipo dedicado a la ingeniería en sistemas de información. Nuestro principal servicio es el análisis, diseño y desarrollo de soluciones de software para clientes particulares, pequeñas empresas y medianas organizaciones que necesiten mejorar la forma en que gestionan su información.</w:t>
       </w:r>
     </w:p>
     <w:p>
@@ -6567,7 +6516,6 @@
                 <w:szCs w:val="22"/>
               </w:rPr>
             </w:pPr>
-            <w:proofErr w:type="gramStart"/>
             <w:r>
               <w:rPr>
                 <w:rFonts w:ascii="Arial" w:hAnsi="Arial" w:cs="Tahoma"/>
@@ -6575,17 +6523,7 @@
                 <w:sz w:val="22"/>
                 <w:szCs w:val="22"/>
               </w:rPr>
-              <w:t>Flujo  Básico</w:t>
-            </w:r>
-            <w:proofErr w:type="gramEnd"/>
-            <w:r>
-              <w:rPr>
-                <w:rFonts w:ascii="Arial" w:hAnsi="Arial" w:cs="Tahoma"/>
-                <w:bCs/>
-                <w:sz w:val="22"/>
-                <w:szCs w:val="22"/>
-              </w:rPr>
-              <w:t>:</w:t>
+              <w:t>Flujo  Básico:</w:t>
             </w:r>
           </w:p>
         </w:tc>
@@ -7418,7 +7356,6 @@
                 <w:szCs w:val="22"/>
               </w:rPr>
             </w:pPr>
-            <w:proofErr w:type="gramStart"/>
             <w:r>
               <w:rPr>
                 <w:rFonts w:ascii="Arial" w:hAnsi="Arial" w:cs="Tahoma"/>
@@ -7427,17 +7364,7 @@
                 <w:szCs w:val="22"/>
               </w:rPr>
               <w:lastRenderedPageBreak/>
-              <w:t>Flujos  Alternativos</w:t>
-            </w:r>
-            <w:proofErr w:type="gramEnd"/>
-            <w:r>
-              <w:rPr>
-                <w:rFonts w:ascii="Arial" w:hAnsi="Arial" w:cs="Tahoma"/>
-                <w:bCs/>
-                <w:sz w:val="22"/>
-                <w:szCs w:val="22"/>
-              </w:rPr>
-              <w:t>:</w:t>
+              <w:t>Flujos  Alternativos:</w:t>
             </w:r>
           </w:p>
           <w:p>
@@ -8241,6 +8168,82 @@
           <w:sz w:val="22"/>
           <w:szCs w:val="22"/>
         </w:rPr>
+        <w:t xml:space="preserve">Diagrama de </w:t>
+      </w:r>
+      <w:r>
+        <w:rPr>
+          <w:sz w:val="22"/>
+          <w:szCs w:val="22"/>
+        </w:rPr>
+        <w:t>Transición</w:t>
+      </w:r>
+      <w:r>
+        <w:rPr>
+          <w:sz w:val="22"/>
+          <w:szCs w:val="22"/>
+        </w:rPr>
+        <w:t xml:space="preserve"> de Estados: Estados por los que pasa el retiro</w:t>
+      </w:r>
+    </w:p>
+    <w:p>
+      <w:r>
+        <w:drawing>
+          <wp:inline distT="0" distB="0" distL="0" distR="0" wp14:anchorId="1535BE60" wp14:editId="4EDA40FA">
+            <wp:extent cx="5400040" cy="1685925"/>
+            <wp:effectExtent l="0" t="0" r="0" b="9525"/>
+            <wp:docPr id="856891995" name="Imagen 1"/>
+            <wp:cNvGraphicFramePr>
+              <a:graphicFrameLocks xmlns:a="http://schemas.openxmlformats.org/drawingml/2006/main" noChangeAspect="1"/>
+            </wp:cNvGraphicFramePr>
+            <a:graphic xmlns:a="http://schemas.openxmlformats.org/drawingml/2006/main">
+              <a:graphicData uri="http://schemas.openxmlformats.org/drawingml/2006/picture">
+                <pic:pic xmlns:pic="http://schemas.openxmlformats.org/drawingml/2006/picture">
+                  <pic:nvPicPr>
+                    <pic:cNvPr id="856891995" name=""/>
+                    <pic:cNvPicPr/>
+                  </pic:nvPicPr>
+                  <pic:blipFill>
+                    <a:blip r:embed="rId15"/>
+                    <a:stretch>
+                      <a:fillRect/>
+                    </a:stretch>
+                  </pic:blipFill>
+                  <pic:spPr>
+                    <a:xfrm>
+                      <a:off x="0" y="0"/>
+                      <a:ext cx="5400040" cy="1685925"/>
+                    </a:xfrm>
+                    <a:prstGeom prst="rect">
+                      <a:avLst/>
+                    </a:prstGeom>
+                  </pic:spPr>
+                </pic:pic>
+              </a:graphicData>
+            </a:graphic>
+          </wp:inline>
+        </w:drawing>
+      </w:r>
+    </w:p>
+    <w:p>
+      <w:pPr>
+        <w:pStyle w:val="Ttulo1"/>
+        <w:numPr>
+          <w:ilvl w:val="0"/>
+          <w:numId w:val="0"/>
+        </w:numPr>
+        <w:spacing w:after="180" w:line="360" w:lineRule="auto"/>
+        <w:ind w:left="-5"/>
+        <w:jc w:val="center"/>
+        <w:rPr>
+          <w:sz w:val="22"/>
+          <w:szCs w:val="22"/>
+        </w:rPr>
+      </w:pPr>
+      <w:r>
+        <w:rPr>
+          <w:sz w:val="22"/>
+          <w:szCs w:val="22"/>
+        </w:rPr>
         <w:t>Anexo: Elicitación</w:t>
       </w:r>
       <w:bookmarkEnd w:id="10"/>
@@ -8281,7 +8284,7 @@
           <w:szCs w:val="22"/>
         </w:rPr>
       </w:pPr>
-      <w:hyperlink r:id="rId15">
+      <w:hyperlink r:id="rId16">
         <w:r>
           <w:rPr>
             <w:rFonts w:ascii="Arial" w:eastAsia="Arial" w:hAnsi="Arial" w:cs="Arial"/>
@@ -8316,6 +8319,7 @@
           <w:noProof/>
           <w:szCs w:val="22"/>
         </w:rPr>
+        <w:lastRenderedPageBreak/>
         <w:drawing>
           <wp:anchor distT="0" distB="0" distL="0" distR="0" simplePos="0" relativeHeight="102" behindDoc="0" locked="0" layoutInCell="0" allowOverlap="1" wp14:anchorId="4670E388" wp14:editId="73D5BC48">
             <wp:simplePos x="0" y="0"/>
@@ -8342,7 +8346,7 @@
                     </pic:cNvPicPr>
                   </pic:nvPicPr>
                   <pic:blipFill>
-                    <a:blip r:embed="rId16"/>
+                    <a:blip r:embed="rId17"/>
                     <a:stretch>
                       <a:fillRect/>
                     </a:stretch>
@@ -8501,7 +8505,7 @@
                           <pic:cNvPicPr/>
                         </pic:nvPicPr>
                         <pic:blipFill>
-                          <a:blip r:embed="rId17"/>
+                          <a:blip r:embed="rId18"/>
                           <a:stretch/>
                         </pic:blipFill>
                         <pic:spPr>
@@ -8650,7 +8654,7 @@
           </mc:Choice>
           <mc:Fallback>
             <w:pict>
-              <v:group w14:anchorId="69A51B3A" id="Group 13652" o:spid="_x0000_s1026" style="width:458.5pt;height:370.3pt;mso-position-horizontal-relative:char;mso-position-vertical-relative:line" coordsize="58230,47026" o:gfxdata="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">
+              <v:group w14:anchorId="69A51B3A" id="Group 13652" o:spid="_x0000_s1026" style="width:458.5pt;height:370.3pt;mso-position-horizontal-relative:char;mso-position-vertical-relative:line" coordsize="58230,47026" o:gfxdata="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">
                 <v:rect id="Cuadro de texto 1273801431" o:spid="_x0000_s1027" style="position:absolute;width:392;height:1386;visibility:visible;mso-wrap-style:square;v-text-anchor:top" o:gfxdata="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" filled="f" stroked="f" strokeweight="0">
                   <v:textbox inset="0,0,0,0">
                     <w:txbxContent>
@@ -8709,7 +8713,7 @@
                   <o:lock v:ext="edit" aspectratio="t"/>
                 </v:shapetype>
                 <v:shape id="Picture 2038" o:spid="_x0000_s1029" type="#_x0000_t75" style="position:absolute;left:284;top:2005;width:57233;height:44334;visibility:visible;mso-wrap-style:square" o:gfxdata="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" strokeweight="0">
-                  <v:imagedata r:id="rId18" o:title=""/>
+                  <v:imagedata r:id="rId19" o:title=""/>
                 </v:shape>
                 <v:line id="Conector recto 10" o:spid="_x0000_s1030" style="position:absolute;visibility:visible;mso-wrap-style:square" from="183,2001" to="57592,2008" o:connectortype="straight" o:gfxdata="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" strokeweight="0"/>
                 <v:line id="Conector recto 11" o:spid="_x0000_s1031" style="position:absolute;visibility:visible;mso-wrap-style:square" from="57592,1951" to="57600,46472" o:connectortype="straight" o:gfxdata="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" strokeweight="0"/>
@@ -10357,7 +10361,7 @@
                           <pic:cNvPicPr/>
                         </pic:nvPicPr>
                         <pic:blipFill>
-                          <a:blip r:embed="rId19"/>
+                          <a:blip r:embed="rId20"/>
                           <a:stretch/>
                         </pic:blipFill>
                         <pic:spPr>
@@ -10508,7 +10512,7 @@
                           <pic:cNvPicPr/>
                         </pic:nvPicPr>
                         <pic:blipFill>
-                          <a:blip r:embed="rId20"/>
+                          <a:blip r:embed="rId21"/>
                           <a:stretch/>
                         </pic:blipFill>
                         <pic:spPr>
@@ -10661,7 +10665,7 @@
           </mc:Choice>
           <mc:Fallback>
             <w:pict>
-              <v:group w14:anchorId="2479EA01" id="Group 14120" o:spid="_x0000_s1034" style="width:456.1pt;height:422.55pt;mso-position-horizontal-relative:char;mso-position-vertical-relative:line" coordsize="57924,53665" o:gfxdata="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">
+              <v:group w14:anchorId="2479EA01" id="Group 14120" o:spid="_x0000_s1034" style="width:456.1pt;height:422.55pt;mso-position-horizontal-relative:char;mso-position-vertical-relative:line" coordsize="57924,53665" o:gfxdata="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">
                 <v:rect id="Cuadro de texto 1021373637" o:spid="_x0000_s1035" style="position:absolute;left:57538;top:30049;width:389;height:1389;visibility:visible;mso-wrap-style:square;v-text-anchor:top" o:gfxdata="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" filled="f" stroked="f" strokeweight="0">
                   <v:textbox inset="0,0,0,0">
                     <w:txbxContent>
@@ -11292,14 +11296,14 @@
                   </v:textbox>
                 </v:rect>
                 <v:shape id="Picture 2101" o:spid="_x0000_s1067" type="#_x0000_t75" style="position:absolute;left:280;top:93;width:56942;height:30651;visibility:visible;mso-wrap-style:square" o:gfxdata="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" filled="t" stroked="t" strokeweight="0">
-                  <v:imagedata r:id="rId21" o:title=""/>
+                  <v:imagedata r:id="rId22" o:title=""/>
                 </v:shape>
                 <v:line id="Conector recto 48" o:spid="_x0000_s1068" style="position:absolute;visibility:visible;mso-wrap-style:square" from="183,43" to="57301,50" o:connectortype="straight" o:gfxdata="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" strokeweight="0"/>
                 <v:line id="Conector recto 49" o:spid="_x0000_s1069" style="position:absolute;visibility:visible;mso-wrap-style:square" from="57301,0" to="57308,30808" o:connectortype="straight" o:gfxdata="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" strokeweight="0"/>
                 <v:line id="Conector recto 50" o:spid="_x0000_s1070" style="position:absolute;flip:x;visibility:visible;mso-wrap-style:square" from="234,30808" to="57344,30816" o:connectortype="straight" o:gfxdata="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" strokeweight="0"/>
                 <v:line id="Conector recto 51" o:spid="_x0000_s1071" style="position:absolute;flip:y;visibility:visible;mso-wrap-style:square" from="234,43" to="241,30852" o:connectortype="straight" o:gfxdata="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" strokeweight="0"/>
                 <v:shape id="Picture 2107" o:spid="_x0000_s1072" type="#_x0000_t75" style="position:absolute;left:280;top:34009;width:43319;height:17006;visibility:visible;mso-wrap-style:square" o:gfxdata="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" filled="t" stroked="t" strokeweight="0">
-                  <v:imagedata r:id="rId22" o:title=""/>
+                  <v:imagedata r:id="rId23" o:title=""/>
                 </v:shape>
                 <v:line id="Conector recto 53" o:spid="_x0000_s1073" style="position:absolute;visibility:visible;mso-wrap-style:square" from="183,33958" to="43660,33966" o:connectortype="straight" o:gfxdata="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" strokeweight="0"/>
                 <v:line id="Conector recto 54" o:spid="_x0000_s1074" style="position:absolute;visibility:visible;mso-wrap-style:square" from="43682,33901" to="43689,51084" o:connectortype="straight" o:gfxdata="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" strokeweight="0"/>
@@ -11451,7 +11455,7 @@
                           <pic:cNvPicPr/>
                         </pic:nvPicPr>
                         <pic:blipFill>
-                          <a:blip r:embed="rId23"/>
+                          <a:blip r:embed="rId24"/>
                           <a:stretch/>
                         </pic:blipFill>
                         <pic:spPr>
@@ -11604,7 +11608,7 @@
           </mc:Choice>
           <mc:Fallback>
             <w:pict>
-              <v:group w14:anchorId="14770289" id="Group 13936" o:spid="_x0000_s1077" style="width:458.5pt;height:290.8pt;mso-position-horizontal-relative:char;mso-position-vertical-relative:line" coordsize="58230,36932" o:gfxdata="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">
+              <v:group w14:anchorId="14770289" id="Group 13936" o:spid="_x0000_s1077" style="width:458.5pt;height:290.8pt;mso-position-horizontal-relative:char;mso-position-vertical-relative:line" coordsize="58230,36932" o:gfxdata="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">
                 <v:rect id="Cuadro de texto 1615641859" o:spid="_x0000_s1078" style="position:absolute;left:57837;top:33591;width:393;height:1386;visibility:visible;mso-wrap-style:square;v-text-anchor:top" o:gfxdata="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" filled="f" stroked="f" strokeweight="0">
                   <v:textbox inset="0,0,0,0">
                     <w:txbxContent>
@@ -11644,7 +11648,7 @@
                   </v:textbox>
                 </v:rect>
                 <v:shape id="Picture 2208" o:spid="_x0000_s1080" type="#_x0000_t75" style="position:absolute;left:284;top:50;width:57233;height:34247;visibility:visible;mso-wrap-style:square" o:gfxdata="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" filled="t" stroked="t" strokeweight="0">
-                  <v:imagedata r:id="rId24" o:title=""/>
+                  <v:imagedata r:id="rId25" o:title=""/>
                 </v:shape>
                 <v:line id="Conector recto 61" o:spid="_x0000_s1081" style="position:absolute;visibility:visible;mso-wrap-style:square" from="183,43" to="57592,50" o:connectortype="straight" o:gfxdata="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" strokeweight="0"/>
                 <v:line id="Conector recto 62" o:spid="_x0000_s1082" style="position:absolute;visibility:visible;mso-wrap-style:square" from="57592,0" to="57600,34412" o:connectortype="straight" o:gfxdata="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" strokeweight="0"/>
@@ -11693,7 +11697,7 @@
           <w:szCs w:val="22"/>
         </w:rPr>
       </w:pPr>
-      <w:hyperlink r:id="rId25">
+      <w:hyperlink r:id="rId26">
         <w:r>
           <w:rPr>
             <w:rFonts w:ascii="Arial" w:eastAsia="Arial" w:hAnsi="Arial" w:cs="Arial"/>
@@ -11826,7 +11830,7 @@
                           <pic:cNvPicPr/>
                         </pic:nvPicPr>
                         <pic:blipFill>
-                          <a:blip r:embed="rId26"/>
+                          <a:blip r:embed="rId27"/>
                           <a:stretch/>
                         </pic:blipFill>
                         <pic:spPr>
@@ -11979,7 +11983,7 @@
           </mc:Choice>
           <mc:Fallback>
             <w:pict>
-              <v:group w14:anchorId="53CC216A" id="Group 13937" o:spid="_x0000_s1085" style="width:457pt;height:266.3pt;mso-position-horizontal-relative:char;mso-position-vertical-relative:line" coordsize="58039,33818" o:gfxdata="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">
+              <v:group w14:anchorId="53CC216A" id="Group 13937" o:spid="_x0000_s1085" style="width:457pt;height:266.3pt;mso-position-horizontal-relative:char;mso-position-vertical-relative:line" coordsize="58039,33818" o:gfxdata="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">
                 <v:rect id="Cuadro de texto 966845656" o:spid="_x0000_s1086" style="position:absolute;left:57646;top:32436;width:393;height:1386;visibility:visible;mso-wrap-style:square;v-text-anchor:top" o:gfxdata="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" filled="f" stroked="f" strokeweight="0">
                   <v:textbox inset="0,0,0,0">
                     <w:txbxContent>
@@ -12000,7 +12004,7 @@
                   </v:textbox>
                 </v:rect>
                 <v:shape id="Picture 2214" o:spid="_x0000_s1087" type="#_x0000_t75" style="position:absolute;left:93;top:50;width:57233;height:33095;visibility:visible;mso-wrap-style:square" o:gfxdata="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" filled="t" stroked="t" strokeweight="0">
-                  <v:imagedata r:id="rId27" o:title=""/>
+                  <v:imagedata r:id="rId28" o:title=""/>
                 </v:shape>
                 <v:line id="Conector recto 68" o:spid="_x0000_s1088" style="position:absolute;visibility:visible;mso-wrap-style:square" from="0,43" to="57405,50" o:connectortype="straight" o:gfxdata="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" strokeweight="0"/>
                 <v:line id="Conector recto 69" o:spid="_x0000_s1089" style="position:absolute;visibility:visible;mso-wrap-style:square" from="57409,0" to="57416,33260" o:connectortype="straight" o:gfxdata="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" strokeweight="0"/>
@@ -12071,7 +12075,7 @@
                     </pic:cNvPicPr>
                   </pic:nvPicPr>
                   <pic:blipFill>
-                    <a:blip r:embed="rId28"/>
+                    <a:blip r:embed="rId29"/>
                     <a:stretch>
                       <a:fillRect/>
                     </a:stretch>
@@ -12166,7 +12170,7 @@
                     </pic:cNvPicPr>
                   </pic:nvPicPr>
                   <pic:blipFill>
-                    <a:blip r:embed="rId29"/>
+                    <a:blip r:embed="rId30"/>
                     <a:stretch>
                       <a:fillRect/>
                     </a:stretch>
@@ -12276,7 +12280,7 @@
                     </pic:cNvPicPr>
                   </pic:nvPicPr>
                   <pic:blipFill>
-                    <a:blip r:embed="rId30"/>
+                    <a:blip r:embed="rId31"/>
                     <a:stretch>
                       <a:fillRect/>
                     </a:stretch>
@@ -12341,7 +12345,7 @@
           <w:szCs w:val="22"/>
         </w:rPr>
       </w:pPr>
-      <w:hyperlink r:id="rId31">
+      <w:hyperlink r:id="rId32">
         <w:r>
           <w:rPr>
             <w:rFonts w:ascii="Arial" w:eastAsia="Arial" w:hAnsi="Arial" w:cs="Arial"/>
@@ -13153,7 +13157,7 @@
                           <pic:cNvPicPr/>
                         </pic:nvPicPr>
                         <pic:blipFill>
-                          <a:blip r:embed="rId32"/>
+                          <a:blip r:embed="rId33"/>
                           <a:stretch/>
                         </pic:blipFill>
                         <pic:spPr>
@@ -13306,7 +13310,7 @@
           </mc:Choice>
           <mc:Fallback>
             <w:pict>
-              <v:group w14:anchorId="30DB5A06" id="Group 13482" o:spid="_x0000_s1092" style="width:458.5pt;height:247.05pt;mso-position-horizontal-relative:char;mso-position-vertical-relative:line" coordsize="58230,31374" o:gfxdata="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">
+              <v:group w14:anchorId="30DB5A06" id="Group 13482" o:spid="_x0000_s1092" style="width:458.5pt;height:247.05pt;mso-position-horizontal-relative:char;mso-position-vertical-relative:line" coordsize="58230,31374" o:gfxdata="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">
                 <v:rect id="Cuadro de texto 1413906796" o:spid="_x0000_s1093" style="position:absolute;width:8827;height:1386;visibility:visible;mso-wrap-style:square;v-text-anchor:top" o:gfxdata="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" filled="f" stroked="f" strokeweight="0">
                   <v:textbox inset="0,0,0,0">
                     <w:txbxContent>
@@ -13593,7 +13597,7 @@
                   </v:textbox>
                 </v:rect>
                 <v:shape id="Picture 2323" o:spid="_x0000_s1108" type="#_x0000_t75" style="position:absolute;left:284;top:1994;width:57233;height:26752;visibility:visible;mso-wrap-style:square" o:gfxdata="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" filled="t" stroked="t" strokeweight="0">
-                  <v:imagedata r:id="rId33" o:title=""/>
+                  <v:imagedata r:id="rId34" o:title=""/>
                 </v:shape>
                 <v:line id="Conector recto 89" o:spid="_x0000_s1109" style="position:absolute;visibility:visible;mso-wrap-style:square" from="183,1951" to="57592,1958" o:connectortype="straight" o:gfxdata="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" strokeweight="0"/>
                 <v:line id="Conector recto 90" o:spid="_x0000_s1110" style="position:absolute;visibility:visible;mso-wrap-style:square" from="57592,1897" to="57600,28807" o:connectortype="straight" o:gfxdata="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" strokeweight="0"/>
@@ -13744,7 +13748,7 @@
                           <pic:cNvPicPr/>
                         </pic:nvPicPr>
                         <pic:blipFill>
-                          <a:blip r:embed="rId34"/>
+                          <a:blip r:embed="rId35"/>
                           <a:stretch/>
                         </pic:blipFill>
                         <pic:spPr>
@@ -13897,7 +13901,7 @@
           </mc:Choice>
           <mc:Fallback>
             <w:pict>
-              <v:group w14:anchorId="6958481A" id="Group 14340" o:spid="_x0000_s1113" style="width:458.5pt;height:220.3pt;mso-position-horizontal-relative:char;mso-position-vertical-relative:line" coordsize="58230,27979" o:gfxdata="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">
+              <v:group w14:anchorId="6958481A" id="Group 14340" o:spid="_x0000_s1113" style="width:458.5pt;height:220.3pt;mso-position-horizontal-relative:char;mso-position-vertical-relative:line" coordsize="58230,27979" o:gfxdata="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">
                 <v:rect id="Cuadro de texto 159190001" o:spid="_x0000_s1114" style="position:absolute;left:57837;top:24649;width:393;height:1379;visibility:visible;mso-wrap-style:square;v-text-anchor:top" o:gfxdata="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" filled="f" stroked="f" strokeweight="0">
                   <v:textbox inset="0,0,0,0">
                     <w:txbxContent>
@@ -13937,7 +13941,7 @@
                   </v:textbox>
                 </v:rect>
                 <v:shape id="Picture 2364" o:spid="_x0000_s1116" type="#_x0000_t75" style="position:absolute;left:284;top:50;width:57233;height:25297;visibility:visible;mso-wrap-style:square" o:gfxdata="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" filled="t" stroked="t" strokeweight="0">
-                  <v:imagedata r:id="rId35" o:title=""/>
+                  <v:imagedata r:id="rId36" o:title=""/>
                 </v:shape>
                 <v:line id="Conector recto 97" o:spid="_x0000_s1117" style="position:absolute;visibility:visible;mso-wrap-style:square" from="183,43" to="57592,50" o:connectortype="straight" o:gfxdata="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" strokeweight="0"/>
                 <v:line id="Conector recto 98" o:spid="_x0000_s1118" style="position:absolute;visibility:visible;mso-wrap-style:square" from="57592,0" to="57600,25462" o:connectortype="straight" o:gfxdata="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" strokeweight="0"/>
@@ -14058,7 +14062,7 @@
                           <pic:cNvPicPr/>
                         </pic:nvPicPr>
                         <pic:blipFill>
-                          <a:blip r:embed="rId36"/>
+                          <a:blip r:embed="rId37"/>
                           <a:stretch/>
                         </pic:blipFill>
                         <pic:spPr>
@@ -14211,7 +14215,7 @@
           </mc:Choice>
           <mc:Fallback>
             <w:pict>
-              <v:group w14:anchorId="0E0747BF" id="Group 14341" o:spid="_x0000_s1121" style="width:332.5pt;height:364.9pt;mso-position-horizontal-relative:char;mso-position-vertical-relative:line" coordsize="42228,46342" o:gfxdata="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">
+              <v:group w14:anchorId="0E0747BF" id="Group 14341" o:spid="_x0000_s1121" style="width:332.5pt;height:364.9pt;mso-position-horizontal-relative:char;mso-position-vertical-relative:line" coordsize="42228,46342" o:gfxdata="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">
                 <v:rect id="Cuadro de texto 595414710" o:spid="_x0000_s1122" style="position:absolute;left:41835;top:44956;width:393;height:1386;visibility:visible;mso-wrap-style:square;v-text-anchor:top" o:gfxdata="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" filled="f" stroked="f" strokeweight="0">
                   <v:textbox inset="0,0,0,0">
                     <w:txbxContent>
@@ -14232,7 +14236,7 @@
                   </v:textbox>
                 </v:rect>
                 <v:shape id="Picture 2370" o:spid="_x0000_s1123" type="#_x0000_t75" style="position:absolute;left:93;top:93;width:41422;height:45562;visibility:visible;mso-wrap-style:square" o:gfxdata="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" filled="t" stroked="t" strokeweight="0">
-                  <v:imagedata r:id="rId37" o:title=""/>
+                  <v:imagedata r:id="rId38" o:title=""/>
                 </v:shape>
                 <v:line id="Conector recto 104" o:spid="_x0000_s1124" style="position:absolute;visibility:visible;mso-wrap-style:square" from="0,43" to="41587,50" o:connectortype="straight" o:gfxdata="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" strokeweight="0"/>
                 <v:line id="Conector recto 105" o:spid="_x0000_s1125" style="position:absolute;visibility:visible;mso-wrap-style:square" from="41590,0" to="41598,45727" o:connectortype="straight" o:gfxdata="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" strokeweight="0"/>
@@ -14402,7 +14406,7 @@
                           <pic:cNvPicPr/>
                         </pic:nvPicPr>
                         <pic:blipFill>
-                          <a:blip r:embed="rId38"/>
+                          <a:blip r:embed="rId39"/>
                           <a:stretch/>
                         </pic:blipFill>
                         <pic:spPr>
@@ -14555,7 +14559,7 @@
           </mc:Choice>
           <mc:Fallback>
             <w:pict>
-              <v:group w14:anchorId="793EE4C7" id="Group 14435" o:spid="_x0000_s1128" style="width:458.5pt;height:245.8pt;mso-position-horizontal-relative:char;mso-position-vertical-relative:line" coordsize="58230,31215" o:gfxdata="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">
+              <v:group w14:anchorId="793EE4C7" id="Group 14435" o:spid="_x0000_s1128" style="width:458.5pt;height:245.8pt;mso-position-horizontal-relative:char;mso-position-vertical-relative:line" coordsize="58230,31215" o:gfxdata="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